<commit_message>
Actualizar título, resumen y abstract del informe y sincronizar README
</commit_message>
<xml_diff>
--- a/UPSAssetManegement Informe.docx
+++ b/UPSAssetManegement Informe.docx
@@ -223,7 +223,7 @@
           <w:sz w:val="32"/>
           <w:lang w:val="es-HN"/>
         </w:rPr>
-        <w:t>UPS ASSET MANEGEMENT</w:t>
+        <w:t>Sistema web de inventario y mantenimiento de UPS para BAC Honduras, 2026</w:t>
       </w:r>
     </w:p>
     <w:p>
@@ -1182,7 +1182,7 @@
           <w:lang w:val="es-HN"/>
         </w:rPr>
         <w:lastRenderedPageBreak/>
-        <w:t>UPS ASSET MANEGEMENT</w:t>
+        <w:t>Sistema web de inventario y mantenimiento de UPS para BAC Honduras, 2026</w:t>
       </w:r>
     </w:p>
     <w:p>
@@ -1704,23 +1704,23 @@
         <w:pStyle w:val="Informe"/>
       </w:pPr>
       <w:r>
-        <w:t xml:space="preserve">Yo, Elton Eduardo Martinez Fuentes, de San Pedro Sula, autor del trabajo de pregrado titulado: UPS </w:t>
+        <w:t xml:space="preserve">Yo, Elton Eduardo Martinez Fuentes, de San Pedro Sula, autor del trabajo de pregrado titulado: Sistema web de inventario y mantenimiento de UPS para BAC Honduras, 2026, que se presenta como requisito previo para optar al título de pregrado en INGENIERÍA EN INFORMÁTICA (en lo sucesivo, el “Trabajo Final de Graduación”) y reconociendo que la presentación del presente documento forma parte de los requerimientos establecidos del programa de pregrado de la Universidad Tecnológica Centroamericana (UNITEC) y del Centro Universitario Tecnológico (CEUTEC), por este medio AUTORIZO a la Universidad Tecnológica Centroamericana (UNITEC) y el Centro Universitario Tecnológico (CEUTEC), para que:</w:t>
       </w:r>
       <w:proofErr w:type="spellStart"/>
       <w:r>
-        <w:t>Asset</w:t>
+        <w:t/>
       </w:r>
       <w:proofErr w:type="spellEnd"/>
       <w:r>
-        <w:t xml:space="preserve"> </w:t>
+        <w:t xml:space="preserve"/>
       </w:r>
       <w:proofErr w:type="spellStart"/>
       <w:r>
-        <w:t>Manegement</w:t>
+        <w:t/>
       </w:r>
       <w:proofErr w:type="spellEnd"/>
       <w:r>
-        <w:t>, BAC Honduras, 2026, que se presenta como requisito previo para optar al título de pregrado en INGENIERÍA EN INFORMÁTICA (en lo sucesivo, el “Trabajo Final de Graduación”) y reconociendo que la presentación del presente documento forma parte de los requerimientos establecidos del programa de pregrado de la Universidad Tecnológica Centroamericana (UNITEC) y del Centro Universitario Tecnológico (CEUTEC), por este medio AUTORIZO a la Universidad Tecnológica Centroamericana (UNITEC) y el Centro Universitario Tecnológico (CEUTEC), para que:</w:t>
+        <w:t/>
       </w:r>
     </w:p>
     <w:p>
@@ -1831,7 +1831,15 @@
         <w:pStyle w:val="Informe"/>
       </w:pPr>
       <w:r>
-        <w:t>Los abajo firmantes damos fe, en nuestra posición de miembro de Terna, Asesor y/o Jefe Académico y en el marco de nuestras responsabilidades adquiridas, que el presente documento cumple con los lineamientos exigidos por la Facultad de Ingeniería y los requerimientos académicos que la Universidad dispone dentro de los procesos de graduación.</w:t>
+        <w:t xml:space="preserve">Los abajo firmantes damos fe, en nuestra posición de miembro de Terna, Asesor y/o </w:t>
+      </w:r>
+      <w:proofErr w:type="gramStart"/>
+      <w:r>
+        <w:t>Jefe</w:t>
+      </w:r>
+      <w:proofErr w:type="gramEnd"/>
+      <w:r>
+        <w:t xml:space="preserve"> Académico y en el marco de nuestras responsabilidades adquiridas, que el presente documento cumple con los lineamientos exigidos por la Facultad de Ingeniería y los requerimientos académicos que la Universidad dispone dentro de los procesos de graduación.</w:t>
       </w:r>
     </w:p>
     <w:p>
@@ -2093,8 +2101,14 @@
         <w:pageBreakBefore/>
       </w:pPr>
       <w:r>
+        <w:rPr>
+          <w:u w:val="single"/>
+        </w:rPr>
         <w:lastRenderedPageBreak/>
-        <w:t>RESUMEN EJECUTIVO</w:t>
+        <w:t>RESUMEN</w:t>
+      </w:r>
+      <w:r>
+        <w:t xml:space="preserve"> EJECUTIVO</w:t>
       </w:r>
     </w:p>
     <w:p>
@@ -2105,7 +2119,7 @@
         <w:rPr>
           <w:b/>
         </w:rPr>
-        <w:t>UPS ASSET MANEGEMENT</w:t>
+        <w:t>Sistema web de inventario y mantenimiento de UPS para BAC Honduras, 2026</w:t>
       </w:r>
     </w:p>
     <w:p>
@@ -2121,23 +2135,23 @@
         <w:pStyle w:val="Informe"/>
       </w:pPr>
       <w:r>
-        <w:t xml:space="preserve">UPS </w:t>
+        <w:t xml:space="preserve">El objetivo de este proyecto es desarrollar una aplicación web para centralizar el inventario de sistemas de alimentación ininterrumpida (UPS) y apoyar el seguimiento de sus baterías en BAC Honduras durante 2026. El trabajo forma parte de mi práctica profesional de Ingeniería en Informática y responde a la dispersión de datos en registros de mantenimiento, que dificulta consultar el historial de los equipos y planificar los reemplazos.</w:t>
       </w:r>
       <w:proofErr w:type="spellStart"/>
       <w:r>
-        <w:t>Asset</w:t>
+        <w:t/>
       </w:r>
       <w:proofErr w:type="spellEnd"/>
       <w:r>
-        <w:t xml:space="preserve"> </w:t>
+        <w:t xml:space="preserve"/>
       </w:r>
       <w:proofErr w:type="spellStart"/>
       <w:r>
-        <w:t>Manegement</w:t>
+        <w:t/>
       </w:r>
       <w:proofErr w:type="spellEnd"/>
       <w:r>
-        <w:t xml:space="preserve"> es una aplicación web que desarrollo como parte de mi práctica profesional de Ingeniería en Informática en BAC Honduras. El proyecto responde a una necesidad concreta: reunir la información de los UPS instalados en las agencias y utilizarla para dar seguimiento a sus baterías. Los datos se encuentran distribuidos en registros de mantenimiento, lo que dificulta consultar el historial de cada equipo y preparar la planificación de reemplazos.</w:t>
+        <w:t xml:space="preserve"/>
       </w:r>
     </w:p>
     <w:p>
@@ -2145,7 +2159,7 @@
         <w:pStyle w:val="Informe"/>
       </w:pPr>
       <w:r>
-        <w:t>La solución reúne el inventario por agencia, las características técnicas de los UPS y la información de sus bancos de baterías. También contempla el registro de mantenimientos y cambios de baterías. A partir de las fechas registradas, los ciclos de reemplazo y los precios configurados para cada año, permite estimar las cantidades de baterías que se necesitarán y su costo. Estas estimaciones sirven como apoyo para preparar el presupuesto; su precisión depende de la actualización de los datos y de los criterios definidos para la operación.</w:t>
+        <w:t>El trabajo se desarrolla a partir de la información del inventario y los registros de mantenimiento, con los que se organizan los datos por agencia, equipo y banco de baterías. La solución utiliza React y Vite, ASP.NET Core sobre .NET 8 y SQL Server. El alcance funcional comprende el inventario, los mantenimientos, los cambios de baterías y la proyección de cantidades y costos según fechas, ciclos de reemplazo y precios anuales. También incluye usuarios, roles y permisos. La validación de estas funciones y la evaluación de los resultados permanecen pendientes de completar mediante pruebas del sistema.</w:t>
       </w:r>
     </w:p>
     <w:p>
@@ -2153,15 +2167,15 @@
         <w:pStyle w:val="Informe"/>
       </w:pPr>
       <w:r>
-        <w:t xml:space="preserve">Para el desarrollo utilizo </w:t>
+        <w:t xml:space="preserve">Como conclusión provisional, la solución ofrece una base para organizar la información y apoyar la planificación presupuestaria de baterías; la utilidad de sus estimaciones depende de datos actualizados y criterios operativos definidos. En esta etapa no se han cuantificado ahorros ni mejoras en tiempos de trabajo. El informe final incorporará los resultados de las pruebas y el análisis costo-beneficio para valorar el aporte del sistema a la empresa.</w:t>
       </w:r>
       <w:proofErr w:type="spellStart"/>
       <w:r>
-        <w:t>React</w:t>
+        <w:t/>
       </w:r>
       <w:proofErr w:type="spellEnd"/>
       <w:r>
-        <w:t xml:space="preserve"> y Vite en la interfaz, ASP.NET Core sobre .NET 8 en la API y SQL Server como base de datos. El alcance incluye usuarios, roles y permisos para organizar el acceso al sistema. Con este proyecto busco aplicar mis conocimientos a una herramienta que facilite la consulta del inventario y la planificación de baterías. La evaluación de los resultados se realizará mediante las pruebas y la validación del sistema.</w:t>
+        <w:t xml:space="preserve"/>
       </w:r>
     </w:p>
     <w:p>
@@ -2200,7 +2214,7 @@
           <w:b/>
           <w:lang w:val="en-US"/>
         </w:rPr>
-        <w:t>UPS ASSET MANEGEMENT</w:t>
+        <w:t>Sistema web de inventario y mantenimiento de UPS para BAC Honduras, 2026</w:t>
       </w:r>
     </w:p>
     <w:p>
@@ -2228,21 +2242,21 @@
         <w:rPr>
           <w:lang w:val="en-US"/>
         </w:rPr>
-        <w:t xml:space="preserve">UPS Asset </w:t>
+        <w:t xml:space="preserve">The objective of this project is to develop a web application to centralize the inventory of uninterruptible power supply (UPS) systems and support battery tracking at BAC Honduras during 2026. The work is part of my professional internship in Computer Engineering and addresses information scattered across maintenance records, which makes it difficult to consult equipment histories and plan replacements.</w:t>
       </w:r>
       <w:proofErr w:type="spellStart"/>
       <w:r>
         <w:rPr>
           <w:lang w:val="en-US"/>
         </w:rPr>
-        <w:t>Manegement</w:t>
+        <w:t/>
       </w:r>
       <w:proofErr w:type="spellEnd"/>
       <w:r>
         <w:rPr>
           <w:lang w:val="en-US"/>
         </w:rPr>
-        <w:t xml:space="preserve"> is a web application that I am developing as part of my professional internship in Computer Engineering at BAC Honduras. The project addresses a specific need: bringing together information about the UPS systems installed at the bank’s branches and using it to track their batteries. Information is currently spread across maintenance records, making it difficult to consult each unit’s history and plan replacements.</w:t>
+        <w:t xml:space="preserve"/>
       </w:r>
     </w:p>
     <w:p>
@@ -2256,7 +2270,7 @@
         <w:rPr>
           <w:lang w:val="en-US"/>
         </w:rPr>
-        <w:t>The solution brings together branch inventories, UPS technical specifications, and battery bank information. It also includes maintenance and battery replacement records. Using recorded dates, replacement cycles, and prices configured for each year, the application estimates the number of batteries needed and their cost. These estimates support budget preparation; their accuracy depends on up-to-date information and the criteria established for operations.</w:t>
+        <w:t>The work is developed using inventory information and maintenance records to organize data by branch, equipment, and battery bank. The solution uses React and Vite, ASP.NET Core on .NET 8, and SQL Server. Its functional scope covers inventory, maintenance, battery replacements, and projections of quantities and costs based on dates, replacement cycles, and annual prices. It also includes users, roles, and permissions. Validation of these functions and assessment of the results remain to be completed through system testing.</w:t>
       </w:r>
     </w:p>
     <w:p>
@@ -2270,7 +2284,7 @@
         <w:rPr>
           <w:lang w:val="en-US"/>
         </w:rPr>
-        <w:t>For development, I use React and Vite for the user interface, ASP.NET Core on .NET 8 for the API, and SQL Server for data storage. The scope includes users, roles, and permissions to organize access to the system. Through this project, I aim to apply my knowledge to a tool that makes inventory information easier to consult and supports battery planning. Results will be assessed through system testing and validation.</w:t>
+        <w:t>As a preliminary conclusion, the solution provides a basis for organizing information and supporting battery budget planning; the usefulness of its estimates depends on up-to-date data and defined operational criteria. At this stage, savings and improvements in working times have not been quantified. The final report will incorporate test results and a cost-benefit analysis to assess the system’s contribution to the company.</w:t>
       </w:r>
     </w:p>
     <w:p>
@@ -6848,7 +6862,15 @@
         <w:pStyle w:val="Informe"/>
       </w:pPr>
       <w:r>
-        <w:t xml:space="preserve">Las actividades registradas en el seguimiento de la práctica incluyen la administración de tickets mediante </w:t>
+        <w:t xml:space="preserve">Las actividades registradas en el seguimiento de la práctica incluyen la administración de </w:t>
+      </w:r>
+      <w:proofErr w:type="gramStart"/>
+      <w:r>
+        <w:t>tickets</w:t>
+      </w:r>
+      <w:proofErr w:type="gramEnd"/>
+      <w:r>
+        <w:t xml:space="preserve"> mediante </w:t>
       </w:r>
       <w:proofErr w:type="spellStart"/>
       <w:r>

</xml_diff>